<commit_message>
docs: add student name Sanchita Suryawanshi and roll no 150096724115 to all documentation, PDFs, Word documents, and UI screens
</commit_message>
<xml_diff>
--- a/Documentation/WikiMove_BRD.docx
+++ b/Documentation/WikiMove_BRD.docx
@@ -122,7 +122,28 @@
           <w:bCs w:val="false"/>
           <w:color w:val="334155"/>
         </w:rPr>
-        <w:t xml:space="preserve"> [Student Name / ID Placeholder]</w:t>
+        <w:t xml:space="preserve"> Sanchita Suryawanshi</w:t>
+      </w:r>
+    </w:p>
+    <w:p>
+      <w:pPr>
+        <w:spacing w:after="120" w:line="260"/>
+      </w:pPr>
+      <w:r>
+        <w:rPr>
+          <w:b/>
+          <w:bCs/>
+          <w:color w:val="1E293B"/>
+        </w:rPr>
+        <w:t xml:space="preserve">Roll Number:</w:t>
+      </w:r>
+      <w:r>
+        <w:rPr>
+          <w:b w:val="false"/>
+          <w:bCs w:val="false"/>
+          <w:color w:val="334155"/>
+        </w:rPr>
+        <w:t xml:space="preserve"> 150096724115</w:t>
       </w:r>
     </w:p>
     <w:p>

</xml_diff>